<commit_message>
docs: atualiza documentacao tecnica para a versao 2.1 (TEX real por IP)
Acompanha as mudancas de codigo das ultimas entregas, seguindo o padrao e o
estilo dos documentos existentes.

Documentacao_Tecnica_Machine_Monitor.docx (Versao 2.0 -> 2.1):
- 4.7 Mapa de registradores TEX: substitui o mapa hipotetico pelo layout
  verificado contra o equipamento (35 holding registers, floats little-endian,
  comandos via fn06 nos registradores 0 e 2).
- 8.4: descreve a sessao TEX como uma instancia por IP (TexG4 nao-singleton) e
  comandos por escrita de registrador, no lugar do antigo modelo por pulso.
- 5.5 / arvore de pastas: mencionam o painel de setup (BCD/camara/testes) e a
  nova funcao de tex_register_map.dart.
- Nova secao 10: changelog da versao 2.1.

Documentacao_Tecnica_Integracao_Modbus.docx:
- Nova secao 6: TEX por IP — mesma estrategia de remocao de singleton aplicada
  a bancada (TexG4 instanciavel, leitura de 35 registradores, comandos fn06).
</commit_message>
<xml_diff>
--- a/Documentacao_Tecnica_Integracao_Modbus.docx
+++ b/Documentacao_Tecnica_Integracao_Modbus.docx
@@ -3121,6 +3121,95 @@
           <w:szCs w:val="22"/>
         </w:rPr>
         <w:t xml:space="preserve">o app monitora múltiplas máquinas simultaneamente, cada uma com seu IP. O Singleton permitia apenas uma conexão global. Agora cada máquina tem sua própria instância de IHMInovance gerenciada pelo ModbusDataSource.</w:t>
+      </w:r>
+    </w:p>
+    <w:p>
+      <w:pPr>
+        <w:pStyle w:val="Heading2"/>
+      </w:pPr>
+      <w:r>
+        <w:t xml:space="preserve">6. TEX por IP — a mesma estratégia aplicada à bancada</w:t>
+      </w:r>
+    </w:p>
+    <w:p>
+      <w:pPr>
+        <w:spacing w:after="120"/>
+      </w:pPr>
+      <w:r>
+        <w:rPr>
+          <w:rFonts w:ascii="Arial" w:cs="Arial" w:eastAsia="Arial" w:hAnsi="Arial"/>
+          <w:sz w:val="22"/>
+          <w:szCs w:val="22"/>
+        </w:rPr>
+        <w:t xml:space="preserve">A bancada de estanqueidade TEX recebeu o mesmo tratamento descrito na seção 5: a classe que conversa com o equipamento (TexG4) deixou de ser um Singleton global e passou a ser instanciável — uma instância por bancada.</w:t>
+      </w:r>
+    </w:p>
+    <w:p>
+      <w:pPr>
+        <w:spacing w:after="120"/>
+      </w:pPr>
+      <w:r>
+        <w:rPr>
+          <w:rFonts w:ascii="Arial" w:cs="Arial" w:eastAsia="Arial" w:hAnsi="Arial"/>
+          <w:sz w:val="22"/>
+          <w:szCs w:val="22"/>
+        </w:rPr>
+        <w:t xml:space="preserve">Cada TEX cadastrada abre a sua própria sessão (ModbusTexDataSource.connect), dona de um TexG4 ligado ao IP daquela máquina. Operar TEX 1, TEX 2… ao mesmo tempo significa conexões independentes, sem estado compartilhado.</w:t>
+      </w:r>
+    </w:p>
+    <w:p>
+      <w:pPr>
+        <w:spacing w:after="60"/>
+        <w:ind w:left="284" w:hanging="170"/>
+      </w:pPr>
+      <w:r>
+        <w:rPr>
+          <w:rFonts w:ascii="Arial" w:cs="Arial" w:eastAsia="Arial" w:hAnsi="Arial"/>
+          <w:sz w:val="22"/>
+          <w:szCs w:val="22"/>
+        </w:rPr>
+        <w:t xml:space="preserve">•  Singleton removido: antes final TEX = TexG4(); agora new TexG4() por bancada, gerenciado pela sessão.</w:t>
+      </w:r>
+    </w:p>
+    <w:p>
+      <w:pPr>
+        <w:spacing w:after="60"/>
+        <w:ind w:left="284" w:hanging="170"/>
+      </w:pPr>
+      <w:r>
+        <w:rPr>
+          <w:rFonts w:ascii="Arial" w:cs="Arial" w:eastAsia="Arial" w:hAnsi="Arial"/>
+          <w:sz w:val="22"/>
+          <w:szCs w:val="22"/>
+        </w:rPr>
+        <w:t xml:space="preserve">•  Leitura: bloco de 35 holding registers a partir do endereço 0; floats remontados em little-endian a partir dos registradores crus (isLittleEndian: false).</w:t>
+      </w:r>
+    </w:p>
+    <w:p>
+      <w:pPr>
+        <w:spacing w:after="60"/>
+        <w:ind w:left="284" w:hanging="170"/>
+      </w:pPr>
+      <w:r>
+        <w:rPr>
+          <w:rFonts w:ascii="Arial" w:cs="Arial" w:eastAsia="Arial" w:hAnsi="Arial"/>
+          <w:sz w:val="22"/>
+          <w:szCs w:val="22"/>
+        </w:rPr>
+        <w:t xml:space="preserve">•  Comandos: escrita de registrador único (fn06) — START grava 8 e STOP grava 4 no registrador 0; o BCD vai no registrador 2.</w:t>
+      </w:r>
+    </w:p>
+    <w:p>
+      <w:pPr>
+        <w:spacing w:after="120"/>
+      </w:pPr>
+      <w:r>
+        <w:rPr>
+          <w:rFonts w:ascii="Arial" w:cs="Arial" w:eastAsia="Arial" w:hAnsi="Arial"/>
+          <w:sz w:val="22"/>
+          <w:szCs w:val="22"/>
+        </w:rPr>
+        <w:t xml:space="preserve">O mapa completo de registradores da TEX está na Documentação Técnica do Machine Monitor (seção 4.7).</w:t>
       </w:r>
     </w:p>
     <w:sectPr>

</xml_diff>